<commit_message>
Fix numerical consistency for Decision Tree generalization gap and dynamic feature importances
</commit_message>
<xml_diff>
--- a/report/Week_4_Machine_Learning_Model_Development_Evaluation.docx
+++ b/report/Week_4_Machine_Learning_Model_Development_Evaluation.docx
@@ -27,7 +27,7 @@
           <w:color w:val="4A5568"/>
           <w:sz w:val="24"/>
         </w:rPr>
-        <w:t>A Rigorous Multiclass Classification Study on Physicochemical Wine Cultivar Fingerprints</w:t>
+        <w:t>A Multiclass Classification Study on Physicochemical Wine Cultivar Fingerprints</w:t>
       </w:r>
     </w:p>
     <w:p>
@@ -52,7 +52,7 @@
         <w:spacing w:before="0" w:after="120" w:line="276" w:lineRule="auto"/>
       </w:pPr>
       <w:r>
-        <w:t>This project develops, validates, and compares a reproducible end-to-end machine learning pipeline for multiclass classification on the Wine dataset from the UCI Machine Learning Repository and scikit-learn. The primary analytical objective is to determine whether 13 chemical and physical measurements derived from Italian wines can reliably classify their cultivar of origin (cultivars 0, 1, and 2, corresponding to Barolo, Grignolino, and Barbera). The experimental pipeline incorporates data hygiene inspection, stratified train-test partitioning (80/20 split, random_state=42), leakage-free standard feature scaling encapsulated inside scikit-learn Pipelines, and rigorous multiclass evaluation.</w:t>
+        <w:t>This project develops, validates, and compares a reproducible end-to-end machine learning pipeline for multiclass classification on the Wine dataset from the UCI Machine Learning Repository and scikit-learn. The primary analytical objective is to determine whether 13 chemical and physical measurements derived from Italian wines can reliably classify their cultivar of origin (cultivars 0, 1, and 2, corresponding to Barolo, Grignolino, and Barbera). The experimental pipeline incorporates data hygiene inspection, stratified train-test partitioning (80/20 split, random_state=42), leakage-free standard feature scaling encapsulated inside scikit-learn Pipelines, and comprehensive multiclass evaluation.</w:t>
       </w:r>
     </w:p>
     <w:p>
@@ -60,7 +60,7 @@
         <w:spacing w:before="0" w:after="160" w:line="276" w:lineRule="auto"/>
       </w:pPr>
       <w:r>
-        <w:t>Three candidate classification algorithms representing distinct inductive biases were implemented: Logistic Regression (multinomial linear baseline with L2 regularization), Random Forest (ensemble bagging of 100 trees), and Decision Tree (single non-linear CART baseline). On the held-out test set (N = 36), the Random Forest model achieved flawless performance (100.0% accuracy, Macro F1 = 1.0000, One-vs-Rest Macro ROC-AUC = 1.0000). Logistic Regression attained 97.22% accuracy (Macro F1 = 0.9710, ROC-AUC = 1.0000) with exactly one borderline misclassification. The single Decision Tree attained 94.44% accuracy (Macro F1 = 0.9457, ROC-AUC = 0.9493) with two misclassifications due to rigid orthogonal decision boundaries. Based on empirical generalization, variance resistance, and multiclass separation, Random Forest is selected as the primary champion model, with standardized Logistic Regression serving as an exceptional, highly interpretable alternative.</w:t>
+        <w:t>Three candidate classification algorithms were evaluated: Logistic Regression (multinomial linear baseline with L2 regularization), Random Forest (ensemble bagging of 100 trees), and Decision Tree (single non-linear CART baseline). On the held-out test set (N = 36), the Random Forest model achieved 100.0% test accuracy (Macro F1 = 1.0000, One-vs-Rest Macro ROC-AUC = 1.0000). Logistic Regression attained 97.22% accuracy (Macro F1 = 0.9710, ROC-AUC = 1.0000) with one misclassification at the default threshold. The perfect ROC-AUC indicates that Logistic Regression ranked the true-class probabilities correctly across classification thresholds, while the single classification error at the default decision threshold resulted in 97.22% accuracy. The single Decision Tree attained 94.44% accuracy (Macro F1 = 0.9457, ROC-AUC = 0.9493) with two misclassifications due to rigid orthogonal decision boundaries. Based on empirical test performance in this experiment, Random Forest is selected as the champion model, with standardized Logistic Regression serving as an interpretable linear alternative.</w:t>
       </w:r>
     </w:p>
     <w:tbl>
@@ -110,7 +110,7 @@
                 <w:color w:val="282828"/>
                 <w:sz w:val="19"/>
               </w:rPr>
-              <w:t>Random Forest achieved 100% test accuracy and 1.0000 Macro F1 with zero generalization gap. Standardized Logistic Regression achieved 97.22% test accuracy with 1.0000 ROC-AUC. Both models successfully demonstrate that physicochemical attributes provide highly separable chemical signatures for cultivar discrimination.</w:t>
+              <w:t>Random Forest achieved 100.0% test accuracy and 1.0000 Macro F1 on the held-out test split (N = 36). Standardized Logistic Regression achieved 97.22% test accuracy with 1.0000 ROC-AUC. Both models demonstrate that physicochemical attributes provide strong predictive signal for wine cultivar classification.</w:t>
             </w:r>
           </w:p>
         </w:tc>
@@ -139,10 +139,10 @@
         <w:spacing w:before="0" w:after="120" w:line="276" w:lineRule="auto"/>
       </w:pPr>
       <w:r>
-        <w:t>Automated cultivar identification and chemical fingerprinting are vital pillars in enology, agricultural economics, and food authentication. Regional wines command distinct commercial valuations and regulatory designations based on cultivar origin. However, traditional sensory profiling is subjective, labor-intensive, and susceptible to cognitive bias. Machine learning provides a principled, data-driven framework to map continuous physicochemical assays directly to cultivar classifications.</w:t>
+        <w:t>Automated cultivar identification and chemical fingerprinting are important techniques in enology, agricultural quality control, and food authentication. Regional wines command distinct commercial valuations and regulatory designations based on cultivar origin. However, traditional sensory profiling can be subjective and labor-intensive. Machine learning provides a structured, data-driven framework to map continuous physicochemical measurements directly to cultivar classifications.</w:t>
         <w:br/>
         <w:br/>
-        <w:t>This project establishes an academic data science workflow adhering to modern reproducibility principles. The study systematically progresses from data verification and pipeline construction through baseline modeling, ensemble comparison, multiclass evaluation, error diagnosis, and deployment readiness analysis.</w:t>
+        <w:t>This project establishes a reproducible machine learning workflow. The study systematically progresses from data verification and pipeline construction through baseline modeling, tree-based comparison, multiclass evaluation, error diagnosis, and future improvement strategies.</w:t>
       </w:r>
     </w:p>
     <w:p>
@@ -176,7 +176,7 @@
         <w:br/>
         <w:t>• Target Space (Y): Discrete multiclass label y in {0, 1, 2} corresponding to three cultivars: Class 0 (Barolo), Class 1 (Grignolino), and Class 2 (Barbera).</w:t>
         <w:br/>
-        <w:t>• Optimization Objective: Learn a parameterized classification function f: X -&gt; Y that maximizes out-of-sample generalization accuracy and macro-averaged F1-score while maintaining robust multiclass discrimination across all classes.</w:t>
+        <w:t>• Optimization Objective: Learn a parameterized classification function f: X -&gt; Y that maximizes out-of-sample generalization accuracy and macro-averaged F1-score while maintaining balanced performance across all classes.</w:t>
       </w:r>
     </w:p>
     <w:p>
@@ -215,7 +215,7 @@
         <w:br/>
         <w:t>Dataset Appropriateness:</w:t>
         <w:br/>
-        <w:t>This dataset is uniquely suited for machine learning benchmarking because it presents a multi-dimensional continuous feature space exhibiting varying scales, significant biological correlations, and mild class imbalance. It provides an ideal testbed for evaluating scale-sensitive linear models (Logistic Regression) against scale-invariant tree ensembles (Random Forest), testing pipeline data-leakage prevention, and conducting multiclass One-vs-Rest ROC diagnostics.</w:t>
+        <w:t>This dataset is well suited for machine learning benchmarking because it presents a multi-dimensional continuous feature space exhibiting varying scales, natural correlations, and mild class imbalance. It provides a practical setting for evaluating scale-sensitive linear models (Logistic Regression) against scale-invariant tree models (Random Forest), testing pipeline data-leakage prevention, and conducting multiclass One-vs-Rest ROC diagnostics.</w:t>
       </w:r>
     </w:p>
     <w:p>
@@ -4696,16 +4696,16 @@
         <w:spacing w:before="0" w:after="120" w:line="276" w:lineRule="auto"/>
       </w:pPr>
       <w:r>
-        <w:t>A rigorous preprocessing protocol was executed to maintain experimental integrity and eliminate data leakage:</w:t>
+        <w:t>A structured preprocessing protocol was executed to maintain experimental integrity and eliminate data leakage:</w:t>
         <w:br/>
         <w:br/>
         <w:t>1. Data Quality Inspection: The raw dataset was inspected for structural anomalies. Exactly 0 missing values and 0 duplicate rows were identified across all 178 records. All 13 predictor columns are floating-point continuous values.</w:t>
         <w:br/>
         <w:br/>
-        <w:t>2. Train/Test Stratification: The dataset was partitioned into a training set (80%, N = 142) and a held-out test set (20%, N = 36) using stratified sampling with a deterministic seed (random_state = 42). Stratification guarantees that the class proportions (Class 0: ~33.1%, Class 1: ~39.9%, Class 2: ~27.0%) are preserved identically in both training (47, 57, 38 samples) and test (12, 14, 10 samples) splits.</w:t>
+        <w:t>2. Train/Test Stratification: The dataset was partitioned into a training set (80%, N = 142) and a held-out test set (20%, N = 36) using stratified sampling with a fixed seed (random_state = 42). Stratification guarantees that the class proportions (Class 0: ~33.1%, Class 1: ~39.9%, Class 2: ~27.0%) are preserved in both training (47, 57, 38 samples) and test (12, 14, 10 samples) splits.</w:t>
         <w:br/>
         <w:br/>
-        <w:t>3. Feature Scaling &amp; Leakage Prevention: Features exhibit disparate numerical ranges (e.g., nonflavanoid phenols range from 0.13 to 0.66 g/L, whereas proline ranges from 278 to 1680 mg/L). Without scaling, gradient-based and distance-sensitive classifiers would place disproportionate weight on high-magnitude features. Standard z-score normalization (StandardScaler) was utilized. To strictly eliminate data snooping and information leakage, the scaler was encapsulated within a scikit-learn Pipeline, ensuring the mean and standard deviation parameters were fitted solely on training folds and applied downstream to test samples without prior exposure.</w:t>
+        <w:t>3. Feature Scaling &amp; Leakage Prevention: Features exhibit disparate numerical ranges (e.g., nonflavanoid phenols range from 0.13 to 0.66 g/L, whereas proline ranges from 278 to 1680 mg/L). Without scaling, linear models would place disproportionate weight on higher-magnitude features. Standard z-score normalization (StandardScaler) was utilized. To prevent data leakage, the scaler was encapsulated within a scikit-learn Pipeline, ensuring scaling parameters were fitted solely on training data and applied downstream to test samples without prior exposure.</w:t>
       </w:r>
     </w:p>
     <w:p>
@@ -4730,16 +4730,16 @@
         <w:spacing w:before="0" w:after="120" w:line="276" w:lineRule="auto"/>
       </w:pPr>
       <w:r>
-        <w:t>Three classification algorithms spanning diverse mathematical paradigms were selected for empirical benchmarking:</w:t>
+        <w:t>Three classification algorithms representing different modeling paradigms were selected for benchmarking:</w:t>
         <w:br/>
         <w:br/>
-        <w:t>1. Logistic Regression (Primary Baseline): A multinomial linear classifier utilizing the softmax link function and L2 weight penalty. Logistic Regression models the log-odds of each class as a linear combination of standardized features. It serves as the primary scientific baseline to test whether linear decision boundaries in standardized space are sufficient to separate the three cultivars.</w:t>
+        <w:t>1. Logistic Regression (Primary Baseline): A multinomial linear classifier utilizing the softmax link function and L2 weight penalty. Logistic Regression models the log-odds of each class as a linear combination of standardized features. It serves as the primary baseline to test whether linear decision boundaries in standardized space are sufficient to separate the three cultivars.</w:t>
         <w:br/>
         <w:br/>
-        <w:t>2. Random Forest Classifier (Non-linear Ensemble): A bagging ensemble composed of 100 de-correlated classification trees with bootstrap aggregation and randomized feature subsets at each split (max_depth = 4). Random Forest provides expressive non-linear decision surfaces, resistance to overfitting, invariance to monotonic feature scaling, and native feature importance extraction via Mean Decrease in Impurity (MDI).</w:t>
+        <w:t>2. Random Forest Classifier (Non-linear Ensemble): A bagging ensemble composed of 100 de-correlated classification trees with bootstrap aggregation and randomized feature subsets at each split (max_depth = 4). Random Forest provides non-linear decision surfaces, resistance to individual tree variance, invariance to monotonic feature scaling, and feature importance estimation via Mean Decrease in Impurity (MDI).</w:t>
         <w:br/>
         <w:br/>
-        <w:t>3. Decision Tree Classifier (Single Non-linear Tree): A single recursive binary partitioning CART model (max_depth = 3, Gini impurity criterion). It provides intuitive rule-based interpretability but is known to suffer from high sample variance and rigid orthogonal decision boundaries.</w:t>
+        <w:t>3. Decision Tree Classifier (Single Non-linear Tree): A single recursive binary partitioning CART model (max_depth = 3, Gini impurity criterion). It provides intuitive rule-based interpretability but can be sensitive to sample variance and rigid orthogonal decision boundaries.</w:t>
       </w:r>
     </w:p>
     <w:p>
@@ -4764,7 +4764,7 @@
         <w:spacing w:before="0" w:after="120" w:line="276" w:lineRule="auto"/>
       </w:pPr>
       <w:r>
-        <w:t>Model training was executed deterministically on the 142-sample training split. For Logistic Regression, optimization was performed using the L-BFGS quasi-Newton solver with a maximum iteration limit of 1000 and default inverse regularization parameter C = 1.0. For Random Forest, an ensemble of 100 estimators was initialized with max_depth = 4 to balance expressive capacity and variance control. For Decision Tree, max_depth = 3 was enforced to prevent deep leaf isolation. All models utilized random_state = 42 for exact execution reproducibility.</w:t>
+        <w:t>Model training was executed deterministically on the 142-sample training split. For Logistic Regression, optimization was performed using the L-BFGS solver with a maximum iteration limit of 1000 and default inverse regularization parameter C = 1.0. For Random Forest, an ensemble of 100 estimators was initialized with max_depth = 4 to balance expressive capacity and variance control. For Decision Tree, max_depth = 3 was used to avoid over-splitting small leaves. All models used random_state = 42 for exact execution reproducibility.</w:t>
       </w:r>
     </w:p>
     <w:p>
@@ -4789,16 +4789,16 @@
         <w:spacing w:before="0" w:after="120" w:line="276" w:lineRule="auto"/>
       </w:pPr>
       <w:r>
-        <w:t>To ensure robust academic evaluation across multiple classes, the following metrics and diagnostic tools were computed:</w:t>
+        <w:t>To evaluate model performance across multiple classes, the following metrics and diagnostic tools were computed:</w:t>
         <w:br/>
         <w:br/>
         <w:t>• Accuracy: The global ratio of correctly classified test samples to total test instances.</w:t>
         <w:br/>
-        <w:t>• Macro-Averaged Precision: The unweighted arithmetic mean of precision across all three classes, giving equal weight to each cultivar regardless of support.</w:t>
+        <w:t>• Macro-Averaged Precision: The unweighted arithmetic mean of precision across all three classes, giving equal weight to each cultivar.</w:t>
         <w:br/>
-        <w:t>• Macro-Averaged Recall: The unweighted mean of class sensitivity (True Positive Rate), assessing the model's ability to detect each cultivar.</w:t>
+        <w:t>• Macro-Averaged Recall: The unweighted mean of class sensitivity (True Positive Rate), assessing detection capability across classes.</w:t>
         <w:br/>
-        <w:t>• Macro-Averaged F1-Score: The harmonic mean of macro precision and macro recall, representing the primary benchmark metric for balanced multi-class performance.</w:t>
+        <w:t>• Macro-Averaged F1-Score: The harmonic mean of macro precision and macro recall, representing balanced multi-class performance.</w:t>
         <w:br/>
         <w:t>• Weighted F1-Score: Support-weighted harmonic mean accounting for slight class sample count differences.</w:t>
         <w:br/>
@@ -4806,7 +4806,7 @@
         <w:br/>
         <w:t>• Multiclass One-vs-Rest (OvR) ROC &amp; AUC: Binarizing the 3-class target into three distinct binary classification problems (Class k vs. Rest), computing the False Positive Rate versus True Positive Rate across probability thresholds, and reporting per-class and macro-average Area Under the ROC Curve.</w:t>
         <w:br/>
-        <w:t>• Generalization Gap Analysis: Quantifying Delta = (Train Metric - Test Metric) to empirically detect overfitting or underfitting.</w:t>
+        <w:t>• Generalization Gap Analysis: Quantifying Delta = (Train Metric - Test Metric) to evaluate training versus test performance.</w:t>
       </w:r>
     </w:p>
     <w:p>
@@ -4831,7 +4831,10 @@
         <w:spacing w:before="0" w:after="120" w:line="276" w:lineRule="auto"/>
       </w:pPr>
       <w:r>
-        <w:t>The empirical performance of all three trained pipelines on the training set (N = 142) and held-out test set (N = 36) is summarized in Table 3. Detailed per-class precision, recall, and F1 metrics for the final models are provided in Table 4.</w:t>
+        <w:t>The empirical performance of all three trained pipelines on the training set (N = 142) and held-out test set (N = 36) is summarized in Table 3. Detailed per-class precision, recall, and F1 metrics are provided in Table 4.</w:t>
+        <w:br/>
+        <w:br/>
+        <w:t>For Logistic Regression, the test accuracy was 97.22% (Macro F1 = 0.9710) and the Macro ROC-AUC was 1.0000. The perfect ROC-AUC indicates that the model ranked the true-class probabilities correctly across classification thresholds, while the single classification error at the default decision threshold resulted in 97.22% accuracy. This demonstrates that ROC-AUC evaluates threshold-independent ranking discrimination, whereas classification accuracy measures discrete decisions at a fixed probability threshold.</w:t>
       </w:r>
     </w:p>
     <w:p>
@@ -5786,7 +5789,7 @@
                 <w:color w:val="282828"/>
                 <w:sz w:val="17"/>
               </w:rPr>
-              <w:t>+4.85%</w:t>
+              <w:t>+4.86%</w:t>
             </w:r>
           </w:p>
         </w:tc>
@@ -7388,7 +7391,7 @@
         <w:spacing w:before="0" w:after="120" w:line="276" w:lineRule="auto"/>
       </w:pPr>
       <w:r>
-        <w:t>Four dedicated publication-grade visualizations were generated to analyze model decision behavior, multiclass separation, calibration, and feature attribution. Each figure is displayed below with its technical interpretation.</w:t>
+        <w:t>Four dedicated visualizations were generated to analyze model decision behavior, multiclass separation, calibration, and feature attribution. Each figure is displayed below with its technical interpretation.</w:t>
       </w:r>
     </w:p>
     <w:p>
@@ -7451,7 +7454,7 @@
           <w:color w:val="323232"/>
           <w:sz w:val="18"/>
         </w:rPr>
-        <w:t>Interpretation: The heatmap displays a perfect diagonal structure with 12/12 Class 0, 14/14 Class 1, and 10/10 Class 2 instances correctly classified. Zero off-diagonal errors were produced, demonstrating complete separability of the test samples across all three cultivars under the bagging ensemble.</w:t>
+        <w:t>Interpretation: The heatmap displays a diagonal structure with 12/12 Class 0, 14/14 Class 1, and 10/10 Class 2 instances correctly classified. Zero off-diagonal errors were produced on this test split, demonstrating strong class separation across all three cultivars under the bagging ensemble.</w:t>
       </w:r>
     </w:p>
     <w:p>
@@ -7514,7 +7517,7 @@
           <w:color w:val="323232"/>
           <w:sz w:val="18"/>
         </w:rPr>
-        <w:t>Interpretation: Random Forest achieves 1.000 across all training and test metrics. Logistic Regression demonstrates robust generalization (0.972 test accuracy, 0.971 F1), closely trailing Random Forest. Decision Tree displays a measurable generalization drop (0.993 train vs. 0.944 test accuracy), illustrating the higher variance inherent in unregularized single-tree models.</w:t>
+        <w:t>Interpretation: Random Forest achieved 1.000 across test metrics on this partition. Logistic Regression showed strong generalization (0.972 test accuracy, 0.971 F1). Decision Tree displayed a measurable generalization drop (0.993 train vs. 0.944 test accuracy, gap = +4.86%), illustrating the higher variance typical of unregularized single-tree models.</w:t>
       </w:r>
     </w:p>
     <w:p>
@@ -7577,7 +7580,7 @@
           <w:color w:val="323232"/>
           <w:sz w:val="18"/>
         </w:rPr>
-        <w:t>Interpretation: The One-vs-Rest ROC analysis yields an Area Under the Curve (AUC) of 1.0000 for Class 0, Class 1, and Class 2, achieving a perfect Macro-Average ROC-AUC of 1.0000. This confirms that the predicted class probability distributions provide flawless rank-order discrimination across varying classification thresholds.</w:t>
+        <w:t>Interpretation: The One-vs-Rest ROC analysis yields an Area Under the Curve (AUC) of 1.0000 across classes, achieving a Macro-Average ROC-AUC of 1.0000. The perfect ROC-AUC indicates that the model ranked the true-class probabilities correctly across classification thresholds, while the single classification error at the default decision threshold resulted in 97.22% accuracy. This illustrates that ROC-AUC evaluates threshold-independent ranking discrimination, whereas classification accuracy measures discrete decisions at a fixed threshold.</w:t>
       </w:r>
     </w:p>
     <w:p>
@@ -7640,7 +7643,7 @@
           <w:color w:val="323232"/>
           <w:sz w:val="18"/>
         </w:rPr>
-        <w:t>Interpretation: Proline (0.198), Flavanoids (0.174), Color Intensity (0.161), and OD280/OD315 of diluted wines (0.126) constitute the top 4 most informative features, accounting for over 65% of aggregate split impurity reduction. Conversely, Ash (0.009) and Nonflavanoid Phenols (0.012) provide minimal discriminatory utility.</w:t>
+        <w:t>Interpretation: color_intensity (0.188), flavanoids (0.167), proline (0.146), and alcohol (0.125) constitute the top 4 most influential features in the Random Forest model, accounting for 62.7% of aggregate split impurity reduction. Conversely, ash (0.017) and nonflavanoid_phenols (0.007) provide the lowest relative split contributions. The feature-importance ranking identifies variables that contributed strongly to the Random Forest's decision structure. These rankings represent model-specific associations and should not be interpreted as evidence of causal biochemical effects.</w:t>
       </w:r>
     </w:p>
     <w:p>
@@ -7665,19 +7668,19 @@
         <w:spacing w:before="0" w:after="120" w:line="276" w:lineRule="auto"/>
       </w:pPr>
       <w:r>
-        <w:t>A granular examination of model misclassifications reveals important insights into cultivar boundary overlap:</w:t>
+        <w:t>A detailed examination of model predictions reveals specific error patterns:</w:t>
         <w:br/>
         <w:br/>
-        <w:t>1. Random Forest Error Inspection: The Random Forest ensemble produced zero errors (0/36) on the test split, achieving 100% precision and recall across all three classes.</w:t>
+        <w:t>1. Random Forest Error Inspection: The Random Forest ensemble produced zero errors (0/36) on the held-out test split, achieving 100% precision and recall across all three classes in this experiment.</w:t>
         <w:br/>
         <w:br/>
-        <w:t>2. Logistic Regression Error Inspection: Logistic Regression committed exactly one misclassification (1/36, Sample Index #123). A ground-truth Class 2 (Barbera) sample was classified as Class 1 (Grignolino). Inspection of the predicted posterior probability distribution reveals: P(Class 0) = 0.0012, P(Class 1) = 0.5843, P(Class 2) = 0.4145. This observation lies directly on the linear hyperplane boundary between Class 1 and Class 2, exhibiting an intermediate flavanoid level (1.20 g/L) and lower color intensity (5.00) than typical Class 2 samples.</w:t>
+        <w:t>2. Logistic Regression Error Inspection: Logistic Regression committed exactly one misclassification (1/36, Sample Index #123). A ground-truth Class 2 (Barbera) sample was predicted as Class 1 (Grignolino). Inspection of the predicted posterior probability distribution reveals: P(Class 0) = 0.0012, P(Class 1) = 0.5843, P(Class 2) = 0.4145. This observation lies near the linear decision boundary between Class 1 and Class 2, exhibiting an intermediate flavanoid measurement (1.20 g/L) and lower color intensity (5.00) relative to typical Class 2 samples.</w:t>
         <w:br/>
         <w:br/>
-        <w:t>3. Decision Tree Error Inspection: The single Decision Tree produced two errors (2/36). It misclassified one Class 0 sample as Class 1 (due to an uncharacteristic proline measurement of 680 mg/L) and one Class 2 sample as Class 1. This demonstrates the primary vulnerability of single decision trees: axis-aligned orthogonal partitions cannot adapt smoothly to diagonal correlation structures among phenolic compounds.</w:t>
+        <w:t>3. Decision Tree Error Inspection: The single Decision Tree produced two errors (2/36). It misclassified one Class 0 sample as Class 1 (due to an uncharacteristic proline measurement of 680 mg/L) and one Class 2 sample as Class 1. This illustrates how axis-aligned orthogonal partitions can struggle near overlapping regional boundaries.</w:t>
         <w:br/>
         <w:br/>
-        <w:t>4. Class Imbalance Impact: The mild class imbalance (Class 0: 33.1%, Class 1: 39.9%, Class 2: 27.0%) did not induce pathological majority-class bias. Stratified sampling successfully maintained representative class proportions.</w:t>
+        <w:t>4. Class Imbalance Impact: The mild class imbalance (Class 0: 33.1%, Class 1: 39.9%, Class 2: 27.0%) did not induce majority-class bias. Stratified sampling preserved representative class proportions across partitions.</w:t>
       </w:r>
     </w:p>
     <w:p>
@@ -7702,19 +7705,19 @@
         <w:spacing w:before="0" w:after="120" w:line="276" w:lineRule="auto"/>
       </w:pPr>
       <w:r>
-        <w:t>Overfitting and underfitting were systematically evaluated by contrasting training performance against held-out test performance:</w:t>
+        <w:t>Overfitting and underfitting were evaluated by comparing training performance against held-out test performance:</w:t>
         <w:br/>
         <w:br/>
-        <w:t>• Underfitting Assessment: None of the candidate models exhibited signs of underfitting. Training accuracies ranged from 99.30% (Decision Tree) to 100.0% (Logistic Regression and Random Forest), confirming that all architectures possess adequate expressive capacity to capture the underlying physicochemical signals.</w:t>
+        <w:t>• Underfitting Assessment: No clear evidence of underfitting was observed based on the training and test performance in this experiment. Training accuracies ranged from 99.30% (Decision Tree) to 100.0% (Logistic Regression and Random Forest), indicating that the candidate models had sufficient expressive capacity to learn the classification patterns in the training data.</w:t>
         <w:br/>
         <w:br/>
-        <w:t xml:space="preserve">• Overfitting Assessment: </w:t>
+        <w:t>• Overfitting Assessment:</w:t>
         <w:br/>
-        <w:t xml:space="preserve">  - Decision Tree: Exhibited measurable overfitting with a generalization gap of Delta = +4.86% (Train Acc = 99.30%, Test Acc = 94.44%; Train F1 = 0.9930, Test F1 = 0.9457). The single tree overfit to specific training split thresholds on proline and flavanoids.</w:t>
+        <w:t xml:space="preserve">  - Decision Tree: The Decision Tree showed a noticeable generalization gap of Delta = +4.86% (Train Acc = 99.30%, Test Acc = 94.44%; Train F1 = 0.9935, Test F1 = 0.9457), reflecting the variance typical of unregularized single tree models on small sample splits.</w:t>
         <w:br/>
-        <w:t xml:space="preserve">  - Logistic Regression: Demonstrated minimal generalization variance with a small gap of Delta = +2.78% (Train Acc = 100.0%, Test Acc = 97.22%; Train F1 = 1.000, Test F1 = 0.9710). The L2 weight penalty effectively controlled parameter magnitude.</w:t>
+        <w:t xml:space="preserve">  - Logistic Regression: Logistic Regression demonstrated stable performance with a modest generalization gap of Delta = +2.78% (Train Acc = 100.00%, Test Acc = 97.22%; Train F1 = 1.0000, Test F1 = 0.9710). The L2 weight penalty controlled parameter magnitude.</w:t>
         <w:br/>
-        <w:t xml:space="preserve">  - Random Forest: Exhibited zero generalization gap (Train Acc = 100.0%, Test Acc = 100.0%; Train F1 = 1.000, Test F1 = 1.000). The bagging mechanism (100 bootstrap trees with random feature subsampling) successfully eliminated individual tree variance without inflating bias.</w:t>
+        <w:t xml:space="preserve">  - Random Forest: The Random Forest showed no observed train-test accuracy gap on this fixed split (Train Acc = 100.0%, Test Acc = 100.0%), suggesting strong generalization in this experiment. However, this result should be interpreted cautiously because evaluation was performed on a single held-out test set.</w:t>
       </w:r>
     </w:p>
     <w:p>
@@ -7739,13 +7742,13 @@
         <w:spacing w:before="0" w:after="120" w:line="276" w:lineRule="auto"/>
       </w:pPr>
       <w:r>
-        <w:t>A holistic comparative synthesis across algorithmic families reveals clear trade-offs between predictive accuracy, variance control, and interpretability:</w:t>
+        <w:t>Comparing the candidate algorithms highlights key trade-offs between predictive performance, variance, and interpretability:</w:t>
         <w:br/>
         <w:br/>
-        <w:t>• Logistic Regression vs. Tree Ensembles: Logistic Regression provides closed-form interpretability through standardized regression coefficients and well-calibrated posterior probabilities. However, it relies on the assumption of linearly separable class distributions. Random Forest relaxes linear assumptions by aggregating non-linear piecewise step functions, capturing complex multi-feature interactions (such as the ratio between flavanoids and color intensity) that linear boundaries cannot represent without explicit polynomial feature engineering.</w:t>
+        <w:t>• Logistic Regression vs. Tree Ensembles: Logistic Regression provides direct coefficient interpretability through standardized regression weights and predicted class probabilities. However, it relies on linear decision boundaries in feature space. Random Forest aggregates multiple decision trees to capture non-linear interactions (such as relationships between flavanoids and color intensity) without requiring manual interaction terms.</w:t>
         <w:br/>
         <w:br/>
-        <w:t>• Single Decision Tree vs. Random Forest: The single Decision Tree is computationally lightweight and produces explicit if-then decision rules. However, its empirical test score (0.9444 accuracy, 0.9457 F1) lags significantly behind Random Forest (1.0000 accuracy, 1.0000 F1). Averaging across 100 randomized trees effectively smooths the jagged decision boundaries of single CART models, resulting in superior generalization.</w:t>
+        <w:t>• Single Decision Tree vs. Random Forest: The single Decision Tree is simple and produces clear if-then rules. However, its empirical test score (94.44% accuracy, 0.9457 F1) was lower than Random Forest (100.0% accuracy, 1.0000 F1). Averaging across 100 randomized trees reduced individual tree variance and improved test performance.</w:t>
       </w:r>
     </w:p>
     <w:p>
@@ -7775,16 +7778,16 @@
         <w:br/>
         <w:t>Justification:</w:t>
         <w:br/>
-        <w:t>1. Superior Test Performance: Random Forest achieved perfect test accuracy (100.0%), Macro Precision (1.0000), Macro Recall (1.0000), and Macro F1-Score (1.0000) on unseen test data.</w:t>
+        <w:t>1. Test Performance: Random Forest was selected as the champion model for this experiment because it achieved the strongest held-out test performance among the evaluated models (100.0% accuracy, Macro F1 = 1.0000, ROC-AUC = 1.0000). This conclusion is specific to the dataset and evaluation protocol used in this study. While the model attained 100% accuracy on the test set, this evaluation split contains 36 observations, so performance should be validated across broader sampling in future work.</w:t>
         <w:br/>
-        <w:t>2. Variance Control: By ensembling 100 decorrelated trees with bootstrap aggregation, Random Forest eliminates the variance observed in single decision trees and prevents overfitting.</w:t>
+        <w:t>2. Variance Control: By ensembling 100 decorrelated trees with bootstrap aggregation, Random Forest reduced the variance observed in the single decision tree.</w:t>
         <w:br/>
-        <w:t>3. Robustness to Scale &amp; Outliers: Random Forest is natively invariant to monotonic feature scaling and robust to extreme chemical concentration outliers.</w:t>
+        <w:t>3. Scale Invariance: Random Forest is natively invariant to monotonic feature scaling and robust to feature magnitude differences.</w:t>
         <w:br/>
-        <w:t>4. Practical Utility: The model provides intrinsic feature importance rankings (Figure 4), offering actionable biochemical insights to enologists regarding the primary discriminants of cultivar identity (proline, flavanoids, color intensity).</w:t>
+        <w:t>4. Feature Attribution: The feature-importance ranking identifies variables that contributed strongly to the Random Forest's decision structure. These rankings represent model-specific associations and should not be interpreted as evidence of causal biochemical effects.</w:t>
         <w:br/>
         <w:br/>
-        <w:t>Alternative Deployment Candidate: Standardized Logistic Regression represents a highly credible, lightweight production alternative (97.22% test accuracy, 1.0000 ROC-AUC) when ultra-fast inference latency and closed-form linear coefficients are required.</w:t>
+        <w:t>Alternative Candidate: Standardized Logistic Regression represents a strong, interpretable alternative (97.22% test accuracy, 1.0000 ROC-AUC) when simple linear coefficients and fast inference are desired.</w:t>
       </w:r>
     </w:p>
     <w:p>
@@ -7809,19 +7812,19 @@
         <w:spacing w:before="0" w:after="120" w:line="276" w:lineRule="auto"/>
       </w:pPr>
       <w:r>
-        <w:t>The findings of this study must be evaluated within the context of several structural limitations:</w:t>
+        <w:t>The findings of this study should be evaluated within the context of several limitations:</w:t>
         <w:br/>
         <w:br/>
-        <w:t>1. Sample Size Constraint: The dataset contains 178 total observations (36 test samples). While standard in academic benchmarking, the small sample size increases confidence interval widths and necessitates cautious interpretation of 100% test accuracy scores.</w:t>
+        <w:t>1. Sample Size Constraint: The dataset contains 178 total observations (36 test samples). While standard for benchmarking, the small sample size increases confidence interval widths, and 100% test accuracy on 36 samples should not be assumed to guarantee error-free performance on new datasets.</w:t>
         <w:br/>
         <w:br/>
-        <w:t>2. Single Geographic Region: All wine samples originate from the same geographical growing area in Italy (Piedmont). The model may not generalize directly to identical cultivars cultivated in different soil terroirs, microclimates, or winemaking traditions.</w:t>
+        <w:t>2. Single Geographic Region: All wine samples originate from the Piedmont region in Italy. The model may not generalize directly to identical cultivars cultivated in different soil types, climates, or winemaking processes.</w:t>
         <w:br/>
         <w:br/>
-        <w:t>3. Temporal / Vintage Invariance: The dataset does not include longitudinal multi-vintage time series data. Variations in annual precipitation and harvest temperatures could shift baseline phenolic concentrations, requiring periodic recalibration.</w:t>
+        <w:t>3. Temporal Invariance: The dataset does not include longitudinal multi-vintage time series data. Annual weather differences can alter phenolic concentrations, which may require periodic recalibration.</w:t>
         <w:br/>
         <w:br/>
-        <w:t>4. Fixed Train/Test Partition: Although stratified, evaluation on a single fixed 80/20 train/test split could be sensitive to specific random state seeding.</w:t>
+        <w:t>4. Fixed Partition: Although stratified, evaluation on a single 80/20 train/test split could be sensitive to the chosen random seed.</w:t>
       </w:r>
     </w:p>
     <w:p>
@@ -7846,22 +7849,22 @@
         <w:spacing w:before="0" w:after="120" w:line="276" w:lineRule="auto"/>
       </w:pPr>
       <w:r>
-        <w:t>To elevate the current baseline pipeline toward enterprise-grade robustness, the following future research and engineering enhancements are proposed:</w:t>
+        <w:t>To provide further experimental robustness beyond the current baseline pipeline, the following future research and engineering enhancements are proposed:</w:t>
         <w:br/>
         <w:br/>
-        <w:t>1. Nested Stratified Cross-Validation: Implementing 5x5 nested Stratified K-Fold cross-validation will provide unbiased variance estimates and empirical confidence intervals across multiple randomized dataset partitions.</w:t>
+        <w:t>1. Stratified Cross-Validation: Implementing repeated Stratified K-Fold cross-validation will provide more comprehensive variance estimates across multiple dataset partitions.</w:t>
         <w:br/>
         <w:br/>
-        <w:t>2. Hyperparameter Optimization: Conducting systematic Bayesian optimization or GridSearchCV over Random Forest hyperparameters (e.g., min_samples_split, min_samples_leaf, max_features, criterion) and Logistic Regression regularization strength (C in logspace).</w:t>
+        <w:t>2. Hyperparameter Optimization: Conducting systematic search (such as GridSearchCV or RandomizedSearchCV) over Random Forest parameters (e.g., min_samples_split, max_features, criterion) and Logistic Regression regularization strength (C).</w:t>
         <w:br/>
         <w:br/>
-        <w:t>3. Dimensionality Reduction &amp; Feature Selection: Applying Principal Component Analysis (PCA) or Recursive Feature Elimination (RFE) to isolate the top 5 most discriminant features (Proline, Flavanoids, Color Intensity, OD280/OD315, Alcohol), thereby reducing lab assay costs without sacrificing classification accuracy.</w:t>
+        <w:t>3. Feature Selection: Utilizing feature importance rankings (color_intensity, flavanoids, proline, alcohol) or Recursive Feature Elimination (RFE) to identify compact feature subsets, potentially reducing laboratory measurement requirements without major loss in accuracy.</w:t>
         <w:br/>
         <w:br/>
-        <w:t>4. Advanced Ensemble &amp; Non-Linear Architectures: Benchmarking Gradient Boosted Decision Trees (XGBoost, LightGBM) and Support Vector Machines (SVM with RBF kernel) on expanded multi-vintage wine collections.</w:t>
+        <w:t>4. Additional Algorithm Benchmarking: Testing algorithms such as Gradient Boosting or Support Vector Machines (SVM with RBF kernel) on expanded datasets.</w:t>
         <w:br/>
         <w:br/>
-        <w:t>5. External Dataset Validation: Validating model inference on international wine databases from diverse global appellations.</w:t>
+        <w:t>5. External Dataset Validation: Testing model generalization on wine datasets collected from different wine-growing regions.</w:t>
       </w:r>
     </w:p>
     <w:p>
@@ -7886,7 +7889,7 @@
         <w:spacing w:before="0" w:after="120" w:line="276" w:lineRule="auto"/>
       </w:pPr>
       <w:r>
-        <w:t>This project successfully designed, implemented, and validated a reproducible multiclass machine learning pipeline for wine cultivar classification. The experimental results demonstrate that 13 physicochemical measurements contain distinct, highly separable biochemical signatures capable of discriminating Italian wine cultivars with exceptional precision. The Random Forest model demonstrated superior classification performance (100% test accuracy, 1.0000 F1-score), while Logistic Regression demonstrated outstanding baseline viability (97.22% test accuracy, 1.0000 ROC-AUC). The complete codebase and experimental protocol satisfy all modern standards of data hygiene, leakage prevention, and computational reproducibility.</w:t>
+        <w:t>This project successfully developed and evaluated a reproducible machine learning pipeline for wine cultivar classification. The experimental results demonstrate that 13 physicochemical measurements provide strong predictive signal for classifying Italian wine cultivars. The Random Forest model achieved strong test performance (100.0% test accuracy, 1.0000 F1-score), while Logistic Regression demonstrated effective baseline performance (97.22% test accuracy, 1.0000 ROC-AUC). The complete codebase and experimental protocol satisfy standard data science practices of data hygiene, leakage prevention, and computational reproducibility.</w:t>
       </w:r>
     </w:p>
     <w:p>

</xml_diff>